<commit_message>
Shrink screenshots in the iPhone install guide
Each screenshot was 8.2" tall and filled a whole page, pushing the text
to the next page and splitting images across pages in the PDF. Resize
all nine to 5.5" tall (same aspect ratio) and regenerate the PDF with
Word: 14 pages down to 11.

Co-Authored-By: Claude Opus 5.5 <noreply@anthropic.com>
</commit_message>
<xml_diff>
--- a/Expenxe installarla sull'iPhone.docx
+++ b/Expenxe installarla sull'iPhone.docx
@@ -186,7 +186,7 @@
       <w:r>
         <w:drawing>
           <wp:inline distT="0" distB="0" distL="0" distR="0">
-            <wp:extent cx="3465779" cy="7498080"/>
+            <wp:extent cx="2324100" cy="5029200"/>
             <wp:docPr id="1" name="image1" descr="Passo 1: pagina di Expenxe in Safari con il pulsante Condividi evidenziato"/>
             <a:graphic xmlns:a="http://schemas.openxmlformats.org/drawingml/2006/main">
               <a:graphicData uri="http://schemas.openxmlformats.org/drawingml/2006/picture">
@@ -204,7 +204,7 @@
                   <pic:spPr>
                     <a:xfrm>
                       <a:off x="0" y="0"/>
-                      <a:ext cx="3465779" cy="7498080"/>
+                      <a:ext cx="2324100" cy="5029200"/>
                     </a:xfrm>
                     <a:prstGeom prst="rect">
                       <a:avLst/>
@@ -249,7 +249,7 @@
       <w:r>
         <w:drawing>
           <wp:inline distT="0" distB="0" distL="0" distR="0">
-            <wp:extent cx="3465779" cy="7498080"/>
+            <wp:extent cx="2324100" cy="5029200"/>
             <wp:docPr id="2" name="image2" descr="Passo 2: menu Condividi con la voce Aggiungi alla schermata Home evidenziata"/>
             <a:graphic xmlns:a="http://schemas.openxmlformats.org/drawingml/2006/main">
               <a:graphicData uri="http://schemas.openxmlformats.org/drawingml/2006/picture">
@@ -267,7 +267,7 @@
                   <pic:spPr>
                     <a:xfrm>
                       <a:off x="0" y="0"/>
-                      <a:ext cx="3465779" cy="7498080"/>
+                      <a:ext cx="2324100" cy="5029200"/>
                     </a:xfrm>
                     <a:prstGeom prst="rect">
                       <a:avLst/>
@@ -312,7 +312,7 @@
       <w:r>
         <w:drawing>
           <wp:inline distT="0" distB="0" distL="0" distR="0">
-            <wp:extent cx="3465779" cy="7498080"/>
+            <wp:extent cx="2324100" cy="5029200"/>
             <wp:docPr id="3" name="image3" descr="Passo 3: schermata Aggiungi alla schermata Home con il pulsante Aggiungi evidenziato"/>
             <a:graphic xmlns:a="http://schemas.openxmlformats.org/drawingml/2006/main">
               <a:graphicData uri="http://schemas.openxmlformats.org/drawingml/2006/picture">
@@ -330,7 +330,7 @@
                   <pic:spPr>
                     <a:xfrm>
                       <a:off x="0" y="0"/>
-                      <a:ext cx="3465779" cy="7498080"/>
+                      <a:ext cx="2324100" cy="5029200"/>
                     </a:xfrm>
                     <a:prstGeom prst="rect">
                       <a:avLst/>
@@ -366,7 +366,7 @@
       <w:r>
         <w:drawing>
           <wp:inline distT="0" distB="0" distL="0" distR="0">
-            <wp:extent cx="3465779" cy="7498080"/>
+            <wp:extent cx="2324100" cy="5029200"/>
             <wp:docPr id="4" name="image4" descr="Passo 4: schermata Home con l'icona Expenxe evidenziata"/>
             <a:graphic xmlns:a="http://schemas.openxmlformats.org/drawingml/2006/main">
               <a:graphicData uri="http://schemas.openxmlformats.org/drawingml/2006/picture">
@@ -384,7 +384,7 @@
                   <pic:spPr>
                     <a:xfrm>
                       <a:off x="0" y="0"/>
-                      <a:ext cx="3465779" cy="7498080"/>
+                      <a:ext cx="2324100" cy="5029200"/>
                     </a:xfrm>
                     <a:prstGeom prst="rect">
                       <a:avLst/>
@@ -467,7 +467,7 @@
       <w:r>
         <w:drawing>
           <wp:inline distT="0" distB="0" distL="0" distR="0">
-            <wp:extent cx="3465779" cy="7498080"/>
+            <wp:extent cx="2324100" cy="5029200"/>
             <wp:docPr id="5" name="image5" descr="Impostazioni: lingua, nome e caricamento del modello"/>
             <a:graphic xmlns:a="http://schemas.openxmlformats.org/drawingml/2006/main">
               <a:graphicData uri="http://schemas.openxmlformats.org/drawingml/2006/picture">
@@ -485,7 +485,7 @@
                   <pic:spPr>
                     <a:xfrm>
                       <a:off x="0" y="0"/>
-                      <a:ext cx="3465779" cy="7498080"/>
+                      <a:ext cx="2324100" cy="5029200"/>
                     </a:xfrm>
                     <a:prstGeom prst="rect">
                       <a:avLst/>
@@ -682,7 +682,7 @@
       <w:r>
         <w:drawing>
           <wp:inline distT="0" distB="0" distL="0" distR="0">
-            <wp:extent cx="3465779" cy="7498080"/>
+            <wp:extent cx="2324100" cy="5029200"/>
             <wp:docPr id="6" name="image6" descr="Nuova spesa: importo, voce del modello, data e destinazione"/>
             <a:graphic xmlns:a="http://schemas.openxmlformats.org/drawingml/2006/main">
               <a:graphicData uri="http://schemas.openxmlformats.org/drawingml/2006/picture">
@@ -700,7 +700,7 @@
                   <pic:spPr>
                     <a:xfrm>
                       <a:off x="0" y="0"/>
-                      <a:ext cx="3465779" cy="7498080"/>
+                      <a:ext cx="2324100" cy="5029200"/>
                     </a:xfrm>
                     <a:prstGeom prst="rect">
                       <a:avLst/>
@@ -718,7 +718,7 @@
       <w:r>
         <w:drawing>
           <wp:inline distT="0" distB="0" distL="0" distR="0">
-            <wp:extent cx="3465779" cy="7498080"/>
+            <wp:extent cx="2324100" cy="5029200"/>
             <wp:docPr id="7" name="image7" descr="Nuova spesa: documento, allegato e Salva"/>
             <a:graphic xmlns:a="http://schemas.openxmlformats.org/drawingml/2006/main">
               <a:graphicData uri="http://schemas.openxmlformats.org/drawingml/2006/picture">
@@ -736,7 +736,7 @@
                   <pic:spPr>
                     <a:xfrm>
                       <a:off x="0" y="0"/>
-                      <a:ext cx="3465779" cy="7498080"/>
+                      <a:ext cx="2324100" cy="5029200"/>
                     </a:xfrm>
                     <a:prstGeom prst="rect">
                       <a:avLst/>
@@ -760,7 +760,7 @@
       <w:r>
         <w:drawing>
           <wp:inline distT="0" distB="0" distL="0" distR="0">
-            <wp:extent cx="3465779" cy="7498080"/>
+            <wp:extent cx="2324100" cy="5029200"/>
             <wp:docPr id="8" name="image8" descr="Lista delle spese di ottobre con i totali"/>
             <a:graphic xmlns:a="http://schemas.openxmlformats.org/drawingml/2006/main">
               <a:graphicData uri="http://schemas.openxmlformats.org/drawingml/2006/picture">
@@ -778,7 +778,7 @@
                   <pic:spPr>
                     <a:xfrm>
                       <a:off x="0" y="0"/>
-                      <a:ext cx="3465779" cy="7498080"/>
+                      <a:ext cx="2324100" cy="5029200"/>
                     </a:xfrm>
                     <a:prstGeom prst="rect">
                       <a:avLst/>
@@ -913,7 +913,7 @@
       <w:r>
         <w:drawing>
           <wp:inline distT="0" distB="0" distL="0" distR="0">
-            <wp:extent cx="3465779" cy="7498080"/>
+            <wp:extent cx="2324100" cy="5029200"/>
             <wp:docPr id="9" name="image9" descr="Nota spese: totali per voce ed elenco numerato"/>
             <a:graphic xmlns:a="http://schemas.openxmlformats.org/drawingml/2006/main">
               <a:graphicData uri="http://schemas.openxmlformats.org/drawingml/2006/picture">
@@ -931,7 +931,7 @@
                   <pic:spPr>
                     <a:xfrm>
                       <a:off x="0" y="0"/>
-                      <a:ext cx="3465779" cy="7498080"/>
+                      <a:ext cx="2324100" cy="5029200"/>
                     </a:xfrm>
                     <a:prstGeom prst="rect">
                       <a:avLst/>

</xml_diff>